<commit_message>
feat(dashboard): synchronize sidebar 1-to-1 with demo script, add numbered steps, breadcrumb banners and visual lambda cards
</commit_message>
<xml_diff>
--- a/Bao_Cao/Kich_Ban_Demo_Bao_Cao_Cuoi_Ky_BigData.docx
+++ b/Bao_Cao/Kich_Ban_Demo_Bao_Cao_Cuoi_Ky_BigData.docx
@@ -480,7 +480,7 @@
                 <w:sz w:val="18"/>
                 <w:rFonts w:ascii="Times New Roman" w:hAnsi="Times New Roman" w:eastAsia="Times New Roman" w:cs="Times New Roman"/>
               </w:rPr>
-              <w:t>Phần 1: Mở đầu</w:t>
+              <w:t>Bước 1: Tổng quan &amp; Mở đầu</w:t>
               <w:br/>
               <w:t>(00:00 - 01:00 | 60s)</w:t>
             </w:r>
@@ -517,7 +517,7 @@
                 <w:sz w:val="18"/>
                 <w:rFonts w:ascii="Times New Roman" w:hAnsi="Times New Roman" w:eastAsia="Times New Roman" w:cs="Times New Roman"/>
               </w:rPr>
-              <w:t>Trang chủ / Header</w:t>
+              <w:t>1. Bản đồ Kiến trúc &amp; Tổng quan</w:t>
             </w:r>
           </w:p>
         </w:tc>
@@ -624,7 +624,7 @@
                 <w:sz w:val="18"/>
                 <w:rFonts w:ascii="Times New Roman" w:hAnsi="Times New Roman" w:eastAsia="Times New Roman" w:cs="Times New Roman"/>
               </w:rPr>
-              <w:t>Phần 2: Kiến trúc &amp; HDFS</w:t>
+              <w:t>Bước 2: Khám phá HDFS Data Lake</w:t>
               <w:br/>
               <w:t>(01:00 - 02:30 | 90s)</w:t>
             </w:r>
@@ -661,9 +661,7 @@
                 <w:sz w:val="18"/>
                 <w:rFonts w:ascii="Times New Roman" w:hAnsi="Times New Roman" w:eastAsia="Times New Roman" w:cs="Times New Roman"/>
               </w:rPr>
-              <w:t>Bản đồ ứng dụng Big Data</w:t>
-              <w:br/>
-              <w:t>Quản trị dữ liệu HDFS Data Lake</w:t>
+              <w:t>2. Quản trị dữ liệu HDFS Data Lake</w:t>
             </w:r>
           </w:p>
         </w:tc>
@@ -698,8 +696,6 @@
                 <w:sz w:val="18"/>
                 <w:rFonts w:ascii="Times New Roman" w:hAnsi="Times New Roman" w:eastAsia="Times New Roman" w:cs="Times New Roman"/>
               </w:rPr>
-              <w:t>http://localhost:8501/?page=Bản+đồ+ứng+dụng+Big+Data</w:t>
-              <w:br/>
               <w:t>http://localhost:8501/?page=Quản+trị+dữ+liệu+HDFS+Data+Lake</w:t>
             </w:r>
           </w:p>
@@ -772,7 +768,7 @@
                 <w:sz w:val="18"/>
                 <w:rFonts w:ascii="Times New Roman" w:hAnsi="Times New Roman" w:eastAsia="Times New Roman" w:cs="Times New Roman"/>
               </w:rPr>
-              <w:t>Phần 3: Benchmark Spark vs Pandas</w:t>
+              <w:t>Bước 3: Benchmark Spark vs Pandas</w:t>
               <w:br/>
               <w:t>(02:30 - 04:00 | 90s)</w:t>
             </w:r>
@@ -809,7 +805,7 @@
                 <w:sz w:val="18"/>
                 <w:rFonts w:ascii="Times New Roman" w:hAnsi="Times New Roman" w:eastAsia="Times New Roman" w:cs="Times New Roman"/>
               </w:rPr>
-              <w:t>Benchmark hiệu năng Spark vs Pandas</w:t>
+              <w:t>3. Benchmark hiệu năng Spark vs Pandas</w:t>
             </w:r>
           </w:p>
         </w:tc>
@@ -916,9 +912,9 @@
                 <w:sz w:val="18"/>
                 <w:rFonts w:ascii="Times New Roman" w:hAnsi="Times New Roman" w:eastAsia="Times New Roman" w:cs="Times New Roman"/>
               </w:rPr>
-              <w:t>Phần 4: PySpark ETL &amp; Spark SQL</w:t>
+              <w:t>Bước 4: PySpark ETL &amp; Lọc niên độ</w:t>
               <w:br/>
-              <w:t>(04:00 - 05:30 | 90s)</w:t>
+              <w:t>(04:00 - 05:00 | 60s)</w:t>
             </w:r>
           </w:p>
         </w:tc>
@@ -953,9 +949,7 @@
                 <w:sz w:val="18"/>
                 <w:rFonts w:ascii="Times New Roman" w:hAnsi="Times New Roman" w:eastAsia="Times New Roman" w:cs="Times New Roman"/>
               </w:rPr>
-              <w:t>Tổng quan thị trường</w:t>
-              <w:br/>
-              <w:t>Phân tích Spark SQL</w:t>
+              <w:t>4. Tổng quan thị trường (PySpark ETL)</w:t>
             </w:r>
           </w:p>
         </w:tc>
@@ -991,8 +985,6 @@
                 <w:rFonts w:ascii="Times New Roman" w:hAnsi="Times New Roman" w:eastAsia="Times New Roman" w:cs="Times New Roman"/>
               </w:rPr>
               <w:t>http://localhost:8501/?page=Tổng+quan+thị+trường</w:t>
-              <w:br/>
-              <w:t>http://localhost:8501/?page=Phân+tích+Spark+SQL</w:t>
             </w:r>
           </w:p>
         </w:tc>
@@ -1064,9 +1056,9 @@
                 <w:sz w:val="18"/>
                 <w:rFonts w:ascii="Times New Roman" w:hAnsi="Times New Roman" w:eastAsia="Times New Roman" w:cs="Times New Roman"/>
               </w:rPr>
-              <w:t>Phần 5: Machine Learning &amp; Săn cầu thủ</w:t>
+              <w:t>Bước 5: Phân tích Spark SQL</w:t>
               <w:br/>
-              <w:t>(05:30 - 07:30 | 120s)</w:t>
+              <w:t>(05:00 - 06:00 | 60s)</w:t>
             </w:r>
           </w:p>
         </w:tc>
@@ -1101,9 +1093,7 @@
                 <w:sz w:val="18"/>
                 <w:rFonts w:ascii="Times New Roman" w:hAnsi="Times New Roman" w:eastAsia="Times New Roman" w:cs="Times New Roman"/>
               </w:rPr>
-              <w:t>Phân cụm K-Means</w:t>
-              <w:br/>
-              <w:t>Dự đoán định giá (ML)</w:t>
+              <w:t>5. Phân tích Spark SQL</w:t>
             </w:r>
           </w:p>
         </w:tc>
@@ -1138,8 +1128,294 @@
                 <w:sz w:val="18"/>
                 <w:rFonts w:ascii="Times New Roman" w:hAnsi="Times New Roman" w:eastAsia="Times New Roman" w:cs="Times New Roman"/>
               </w:rPr>
+              <w:t>http://localhost:8501/?page=Phân+tích+Spark+SQL</w:t>
+            </w:r>
+          </w:p>
+        </w:tc>
+        <w:tc>
+          <w:tcPr>
+            <w:tcW w:type="dxa" w:w="1584"/>
+            <w:shd w:fill="FFFFFF"/>
+            <w:tcMar>
+              <w:top w:w="50" w:type="dxa"/>
+              <w:bottom w:w="50" w:type="dxa"/>
+              <w:left w:w="70" w:type="dxa"/>
+              <w:right w:w="70" w:type="dxa"/>
+            </w:tcMar>
+            <w:tcBorders>
+              <w:top w:val="single" w:sz="4" w:space="0" w:color="E2E8F0"/>
+              <w:bottom w:val="single" w:sz="4" w:space="0" w:color="E2E8F0"/>
+              <w:left w:val="none"/>
+              <w:right w:val="none"/>
+            </w:tcBorders>
+          </w:tcPr>
+          <w:p>
+            <w:pPr>
+              <w:spacing w:before="20" w:after="20" w:line="264" w:lineRule="auto"/>
+              <w:jc w:val="left"/>
+            </w:pPr>
+            <w:r>
+              <w:rPr>
+                <w:rFonts w:ascii="Times New Roman" w:hAnsi="Times New Roman"/>
+                <w:b/>
+                <w:i w:val="0"/>
+                <w:color w:val="1E293B"/>
+                <w:sz w:val="18"/>
+                <w:rFonts w:ascii="Times New Roman" w:hAnsi="Times New Roman" w:eastAsia="Times New Roman" w:cs="Times New Roman"/>
+              </w:rPr>
+              <w:t>Chu Văn Quốc Trung</w:t>
+            </w:r>
+          </w:p>
+        </w:tc>
+      </w:tr>
+      <w:tr>
+        <w:tc>
+          <w:tcPr>
+            <w:tcW w:type="dxa" w:w="2448"/>
+            <w:shd w:fill="F8FAFC"/>
+            <w:tcMar>
+              <w:top w:w="50" w:type="dxa"/>
+              <w:bottom w:w="50" w:type="dxa"/>
+              <w:left w:w="70" w:type="dxa"/>
+              <w:right w:w="70" w:type="dxa"/>
+            </w:tcMar>
+            <w:tcBorders>
+              <w:top w:val="single" w:sz="4" w:space="0" w:color="E2E8F0"/>
+              <w:bottom w:val="single" w:sz="4" w:space="0" w:color="E2E8F0"/>
+              <w:left w:val="none"/>
+              <w:right w:val="none"/>
+            </w:tcBorders>
+          </w:tcPr>
+          <w:p>
+            <w:pPr>
+              <w:spacing w:before="20" w:after="20" w:line="264" w:lineRule="auto"/>
+              <w:jc w:val="center"/>
+            </w:pPr>
+            <w:r>
+              <w:rPr>
+                <w:rFonts w:ascii="Times New Roman" w:hAnsi="Times New Roman"/>
+                <w:b/>
+                <w:i w:val="0"/>
+                <w:color w:val="1E293B"/>
+                <w:sz w:val="18"/>
+                <w:rFonts w:ascii="Times New Roman" w:hAnsi="Times New Roman" w:eastAsia="Times New Roman" w:cs="Times New Roman"/>
+              </w:rPr>
+              <w:t>Bước 6: Phân cụm K-Means</w:t>
+              <w:br/>
+              <w:t>(06:00 - 06:45 | 45s)</w:t>
+            </w:r>
+          </w:p>
+        </w:tc>
+        <w:tc>
+          <w:tcPr>
+            <w:tcW w:type="dxa" w:w="2592"/>
+            <w:shd w:fill="F8FAFC"/>
+            <w:tcMar>
+              <w:top w:w="50" w:type="dxa"/>
+              <w:bottom w:w="50" w:type="dxa"/>
+              <w:left w:w="70" w:type="dxa"/>
+              <w:right w:w="70" w:type="dxa"/>
+            </w:tcMar>
+            <w:tcBorders>
+              <w:top w:val="single" w:sz="4" w:space="0" w:color="E2E8F0"/>
+              <w:bottom w:val="single" w:sz="4" w:space="0" w:color="E2E8F0"/>
+              <w:left w:val="none"/>
+              <w:right w:val="none"/>
+            </w:tcBorders>
+          </w:tcPr>
+          <w:p>
+            <w:pPr>
+              <w:spacing w:before="20" w:after="20" w:line="264" w:lineRule="auto"/>
+              <w:jc w:val="center"/>
+            </w:pPr>
+            <w:r>
+              <w:rPr>
+                <w:rFonts w:ascii="Times New Roman" w:hAnsi="Times New Roman"/>
+                <w:b w:val="0"/>
+                <w:i w:val="0"/>
+                <w:color w:val="1E293B"/>
+                <w:sz w:val="18"/>
+                <w:rFonts w:ascii="Times New Roman" w:hAnsi="Times New Roman" w:eastAsia="Times New Roman" w:cs="Times New Roman"/>
+              </w:rPr>
+              <w:t>6. Phân cụm K-Means (MLlib)</w:t>
+            </w:r>
+          </w:p>
+        </w:tc>
+        <w:tc>
+          <w:tcPr>
+            <w:tcW w:type="dxa" w:w="2736"/>
+            <w:shd w:fill="F8FAFC"/>
+            <w:tcMar>
+              <w:top w:w="50" w:type="dxa"/>
+              <w:bottom w:w="50" w:type="dxa"/>
+              <w:left w:w="70" w:type="dxa"/>
+              <w:right w:w="70" w:type="dxa"/>
+            </w:tcMar>
+            <w:tcBorders>
+              <w:top w:val="single" w:sz="4" w:space="0" w:color="E2E8F0"/>
+              <w:bottom w:val="single" w:sz="4" w:space="0" w:color="E2E8F0"/>
+              <w:left w:val="none"/>
+              <w:right w:val="none"/>
+            </w:tcBorders>
+          </w:tcPr>
+          <w:p>
+            <w:pPr>
+              <w:spacing w:before="20" w:after="20" w:line="264" w:lineRule="auto"/>
+              <w:jc w:val="left"/>
+            </w:pPr>
+            <w:r>
+              <w:rPr>
+                <w:rFonts w:ascii="Times New Roman" w:hAnsi="Times New Roman"/>
+                <w:b w:val="0"/>
+                <w:i w:val="0"/>
+                <w:color w:val="1E293B"/>
+                <w:sz w:val="18"/>
+                <w:rFonts w:ascii="Times New Roman" w:hAnsi="Times New Roman" w:eastAsia="Times New Roman" w:cs="Times New Roman"/>
+              </w:rPr>
               <w:t>http://localhost:8501/?page=Phân+cụm+K-Means</w:t>
+            </w:r>
+          </w:p>
+        </w:tc>
+        <w:tc>
+          <w:tcPr>
+            <w:tcW w:type="dxa" w:w="1584"/>
+            <w:shd w:fill="F8FAFC"/>
+            <w:tcMar>
+              <w:top w:w="50" w:type="dxa"/>
+              <w:bottom w:w="50" w:type="dxa"/>
+              <w:left w:w="70" w:type="dxa"/>
+              <w:right w:w="70" w:type="dxa"/>
+            </w:tcMar>
+            <w:tcBorders>
+              <w:top w:val="single" w:sz="4" w:space="0" w:color="E2E8F0"/>
+              <w:bottom w:val="single" w:sz="4" w:space="0" w:color="E2E8F0"/>
+              <w:left w:val="none"/>
+              <w:right w:val="none"/>
+            </w:tcBorders>
+          </w:tcPr>
+          <w:p>
+            <w:pPr>
+              <w:spacing w:before="20" w:after="20" w:line="264" w:lineRule="auto"/>
+              <w:jc w:val="left"/>
+            </w:pPr>
+            <w:r>
+              <w:rPr>
+                <w:rFonts w:ascii="Times New Roman" w:hAnsi="Times New Roman"/>
+                <w:b/>
+                <w:i w:val="0"/>
+                <w:color w:val="1E293B"/>
+                <w:sz w:val="18"/>
+                <w:rFonts w:ascii="Times New Roman" w:hAnsi="Times New Roman" w:eastAsia="Times New Roman" w:cs="Times New Roman"/>
+              </w:rPr>
+              <w:t>Chu Văn Quốc Trung</w:t>
+            </w:r>
+          </w:p>
+        </w:tc>
+      </w:tr>
+      <w:tr>
+        <w:tc>
+          <w:tcPr>
+            <w:tcW w:type="dxa" w:w="2448"/>
+            <w:shd w:fill="FFFFFF"/>
+            <w:tcMar>
+              <w:top w:w="50" w:type="dxa"/>
+              <w:bottom w:w="50" w:type="dxa"/>
+              <w:left w:w="70" w:type="dxa"/>
+              <w:right w:w="70" w:type="dxa"/>
+            </w:tcMar>
+            <w:tcBorders>
+              <w:top w:val="single" w:sz="4" w:space="0" w:color="E2E8F0"/>
+              <w:bottom w:val="single" w:sz="4" w:space="0" w:color="E2E8F0"/>
+              <w:left w:val="none"/>
+              <w:right w:val="none"/>
+            </w:tcBorders>
+          </w:tcPr>
+          <w:p>
+            <w:pPr>
+              <w:spacing w:before="20" w:after="20" w:line="264" w:lineRule="auto"/>
+              <w:jc w:val="center"/>
+            </w:pPr>
+            <w:r>
+              <w:rPr>
+                <w:rFonts w:ascii="Times New Roman" w:hAnsi="Times New Roman"/>
+                <w:b/>
+                <w:i w:val="0"/>
+                <w:color w:val="1E293B"/>
+                <w:sz w:val="18"/>
+                <w:rFonts w:ascii="Times New Roman" w:hAnsi="Times New Roman" w:eastAsia="Times New Roman" w:cs="Times New Roman"/>
+              </w:rPr>
+              <w:t>Bước 7: Định giá ML &amp; Săn cầu thủ</w:t>
               <w:br/>
+              <w:t>(06:45 - 07:45 | 60s)</w:t>
+            </w:r>
+          </w:p>
+        </w:tc>
+        <w:tc>
+          <w:tcPr>
+            <w:tcW w:type="dxa" w:w="2592"/>
+            <w:shd w:fill="FFFFFF"/>
+            <w:tcMar>
+              <w:top w:w="50" w:type="dxa"/>
+              <w:bottom w:w="50" w:type="dxa"/>
+              <w:left w:w="70" w:type="dxa"/>
+              <w:right w:w="70" w:type="dxa"/>
+            </w:tcMar>
+            <w:tcBorders>
+              <w:top w:val="single" w:sz="4" w:space="0" w:color="E2E8F0"/>
+              <w:bottom w:val="single" w:sz="4" w:space="0" w:color="E2E8F0"/>
+              <w:left w:val="none"/>
+              <w:right w:val="none"/>
+            </w:tcBorders>
+          </w:tcPr>
+          <w:p>
+            <w:pPr>
+              <w:spacing w:before="20" w:after="20" w:line="264" w:lineRule="auto"/>
+              <w:jc w:val="center"/>
+            </w:pPr>
+            <w:r>
+              <w:rPr>
+                <w:rFonts w:ascii="Times New Roman" w:hAnsi="Times New Roman"/>
+                <w:b w:val="0"/>
+                <w:i w:val="0"/>
+                <w:color w:val="1E293B"/>
+                <w:sz w:val="18"/>
+                <w:rFonts w:ascii="Times New Roman" w:hAnsi="Times New Roman" w:eastAsia="Times New Roman" w:cs="Times New Roman"/>
+              </w:rPr>
+              <w:t>7. Dự đoán định giá (ML &amp; XAI)</w:t>
+            </w:r>
+          </w:p>
+        </w:tc>
+        <w:tc>
+          <w:tcPr>
+            <w:tcW w:type="dxa" w:w="2736"/>
+            <w:shd w:fill="FFFFFF"/>
+            <w:tcMar>
+              <w:top w:w="50" w:type="dxa"/>
+              <w:bottom w:w="50" w:type="dxa"/>
+              <w:left w:w="70" w:type="dxa"/>
+              <w:right w:w="70" w:type="dxa"/>
+            </w:tcMar>
+            <w:tcBorders>
+              <w:top w:val="single" w:sz="4" w:space="0" w:color="E2E8F0"/>
+              <w:bottom w:val="single" w:sz="4" w:space="0" w:color="E2E8F0"/>
+              <w:left w:val="none"/>
+              <w:right w:val="none"/>
+            </w:tcBorders>
+          </w:tcPr>
+          <w:p>
+            <w:pPr>
+              <w:spacing w:before="20" w:after="20" w:line="264" w:lineRule="auto"/>
+              <w:jc w:val="left"/>
+            </w:pPr>
+            <w:r>
+              <w:rPr>
+                <w:rFonts w:ascii="Times New Roman" w:hAnsi="Times New Roman"/>
+                <w:b w:val="0"/>
+                <w:i w:val="0"/>
+                <w:color w:val="1E293B"/>
+                <w:sz w:val="18"/>
+                <w:rFonts w:ascii="Times New Roman" w:hAnsi="Times New Roman" w:eastAsia="Times New Roman" w:cs="Times New Roman"/>
+              </w:rPr>
               <w:t>http://localhost:8501/?page=Dự+đoán+định+giá+(ML)</w:t>
             </w:r>
           </w:p>
@@ -1212,9 +1488,9 @@
                 <w:sz w:val="18"/>
                 <w:rFonts w:ascii="Times New Roman" w:hAnsi="Times New Roman" w:eastAsia="Times New Roman" w:cs="Times New Roman"/>
               </w:rPr>
-              <w:t>Phần 6: Kafka Streaming &amp; Airflow</w:t>
+              <w:t>Bước 8: Dòng dữ liệu Kafka Streaming</w:t>
               <w:br/>
-              <w:t>(07:30 - 08:30 | 60s)</w:t>
+              <w:t>(07:45 - 08:30 | 45s)</w:t>
             </w:r>
           </w:p>
         </w:tc>
@@ -1249,9 +1525,7 @@
                 <w:sz w:val="18"/>
                 <w:rFonts w:ascii="Times New Roman" w:hAnsi="Times New Roman" w:eastAsia="Times New Roman" w:cs="Times New Roman"/>
               </w:rPr>
-              <w:t>Dòng dữ liệu Kafka Streaming</w:t>
-              <w:br/>
-              <w:t>Điều phối Airflow Workflow</w:t>
+              <w:t>8. Dòng dữ liệu Kafka Streaming</w:t>
             </w:r>
           </w:p>
         </w:tc>
@@ -1287,8 +1561,6 @@
                 <w:rFonts w:ascii="Times New Roman" w:hAnsi="Times New Roman" w:eastAsia="Times New Roman" w:cs="Times New Roman"/>
               </w:rPr>
               <w:t>http://localhost:8501/?page=Dòng+dữ+liệu+Kafka+Streaming</w:t>
-              <w:br/>
-              <w:t>http://localhost:8501/?page=Điều+phối+Airflow+Workflow</w:t>
             </w:r>
           </w:p>
         </w:tc>
@@ -1360,9 +1632,9 @@
                 <w:sz w:val="18"/>
                 <w:rFonts w:ascii="Times New Roman" w:hAnsi="Times New Roman" w:eastAsia="Times New Roman" w:cs="Times New Roman"/>
               </w:rPr>
-              <w:t>Phần 7: CSDL Data Mart &amp; Kết luận</w:t>
+              <w:t>Bước 9: Điều phối Airflow Workflow</w:t>
               <w:br/>
-              <w:t>(08:30 - 09:30 | 60s)</w:t>
+              <w:t>(08:30 - 09:15 | 45s)</w:t>
             </w:r>
           </w:p>
         </w:tc>
@@ -1397,7 +1669,7 @@
                 <w:sz w:val="18"/>
                 <w:rFonts w:ascii="Times New Roman" w:hAnsi="Times New Roman" w:eastAsia="Times New Roman" w:cs="Times New Roman"/>
               </w:rPr>
-              <w:t>Truy vấn CSDL Data Mart</w:t>
+              <w:t>9. Điều phối Airflow Workflow</w:t>
             </w:r>
           </w:p>
         </w:tc>
@@ -1432,7 +1704,7 @@
                 <w:sz w:val="18"/>
                 <w:rFonts w:ascii="Times New Roman" w:hAnsi="Times New Roman" w:eastAsia="Times New Roman" w:cs="Times New Roman"/>
               </w:rPr>
-              <w:t>http://localhost:8501/?page=Truy+vấn+CSDL+Data+Mart</w:t>
+              <w:t>http://localhost:8501/?page=Điều+phối+Airflow+Workflow</w:t>
             </w:r>
           </w:p>
         </w:tc>
@@ -1504,9 +1776,9 @@
                 <w:sz w:val="18"/>
                 <w:rFonts w:ascii="Times New Roman" w:hAnsi="Times New Roman" w:eastAsia="Times New Roman" w:cs="Times New Roman"/>
               </w:rPr>
-              <w:t>Phần 8: Trả lời câu hỏi của Thầy</w:t>
+              <w:t>Bước 10: CSDL Data Mart &amp; Tổng kết</w:t>
               <w:br/>
-              <w:t>(09:30 - 14:00 | 5 phút)</w:t>
+              <w:t>(09:15 - 10:00 | 45s)</w:t>
             </w:r>
           </w:p>
         </w:tc>
@@ -1541,7 +1813,7 @@
                 <w:sz w:val="18"/>
                 <w:rFonts w:ascii="Times New Roman" w:hAnsi="Times New Roman" w:eastAsia="Times New Roman" w:cs="Times New Roman"/>
               </w:rPr>
-              <w:t>Toàn bộ Dashboard &amp; Terminal Logs</w:t>
+              <w:t>10. Truy vấn CSDL Data Mart</w:t>
             </w:r>
           </w:p>
         </w:tc>
@@ -1576,7 +1848,7 @@
                 <w:sz w:val="18"/>
                 <w:rFonts w:ascii="Times New Roman" w:hAnsi="Times New Roman" w:eastAsia="Times New Roman" w:cs="Times New Roman"/>
               </w:rPr>
-              <w:t>Cổng 8501, 9870, 8080</w:t>
+              <w:t>http://localhost:8501/?page=Truy+vấn+CSDL+Data+Mart</w:t>
             </w:r>
           </w:p>
         </w:tc>
@@ -1584,6 +1856,150 @@
           <w:tcPr>
             <w:tcW w:type="dxa" w:w="1584"/>
             <w:shd w:fill="F8FAFC"/>
+            <w:tcMar>
+              <w:top w:w="50" w:type="dxa"/>
+              <w:bottom w:w="50" w:type="dxa"/>
+              <w:left w:w="70" w:type="dxa"/>
+              <w:right w:w="70" w:type="dxa"/>
+            </w:tcMar>
+            <w:tcBorders>
+              <w:top w:val="single" w:sz="4" w:space="0" w:color="E2E8F0"/>
+              <w:bottom w:val="single" w:sz="4" w:space="0" w:color="E2E8F0"/>
+              <w:left w:val="none"/>
+              <w:right w:val="none"/>
+            </w:tcBorders>
+          </w:tcPr>
+          <w:p>
+            <w:pPr>
+              <w:spacing w:before="20" w:after="20" w:line="264" w:lineRule="auto"/>
+              <w:jc w:val="left"/>
+            </w:pPr>
+            <w:r>
+              <w:rPr>
+                <w:rFonts w:ascii="Times New Roman" w:hAnsi="Times New Roman"/>
+                <w:b/>
+                <w:i w:val="0"/>
+                <w:color w:val="1E293B"/>
+                <w:sz w:val="18"/>
+                <w:rFonts w:ascii="Times New Roman" w:hAnsi="Times New Roman" w:eastAsia="Times New Roman" w:cs="Times New Roman"/>
+              </w:rPr>
+              <w:t>Nguyễn Thế Quang</w:t>
+            </w:r>
+          </w:p>
+        </w:tc>
+      </w:tr>
+      <w:tr>
+        <w:tc>
+          <w:tcPr>
+            <w:tcW w:type="dxa" w:w="2448"/>
+            <w:shd w:fill="FFFFFF"/>
+            <w:tcMar>
+              <w:top w:w="50" w:type="dxa"/>
+              <w:bottom w:w="50" w:type="dxa"/>
+              <w:left w:w="70" w:type="dxa"/>
+              <w:right w:w="70" w:type="dxa"/>
+            </w:tcMar>
+            <w:tcBorders>
+              <w:top w:val="single" w:sz="4" w:space="0" w:color="E2E8F0"/>
+              <w:bottom w:val="single" w:sz="4" w:space="0" w:color="E2E8F0"/>
+              <w:left w:val="none"/>
+              <w:right w:val="none"/>
+            </w:tcBorders>
+          </w:tcPr>
+          <w:p>
+            <w:pPr>
+              <w:spacing w:before="20" w:after="20" w:line="264" w:lineRule="auto"/>
+              <w:jc w:val="center"/>
+            </w:pPr>
+            <w:r>
+              <w:rPr>
+                <w:rFonts w:ascii="Times New Roman" w:hAnsi="Times New Roman"/>
+                <w:b/>
+                <w:i w:val="0"/>
+                <w:color w:val="1E293B"/>
+                <w:sz w:val="18"/>
+                <w:rFonts w:ascii="Times New Roman" w:hAnsi="Times New Roman" w:eastAsia="Times New Roman" w:cs="Times New Roman"/>
+              </w:rPr>
+              <w:t>Vấn đáp: Trả lời câu hỏi của Thầy</w:t>
+              <w:br/>
+              <w:t>(10:00 - 15:00 | 5 phút)</w:t>
+            </w:r>
+          </w:p>
+        </w:tc>
+        <w:tc>
+          <w:tcPr>
+            <w:tcW w:type="dxa" w:w="2592"/>
+            <w:shd w:fill="FFFFFF"/>
+            <w:tcMar>
+              <w:top w:w="50" w:type="dxa"/>
+              <w:bottom w:w="50" w:type="dxa"/>
+              <w:left w:w="70" w:type="dxa"/>
+              <w:right w:w="70" w:type="dxa"/>
+            </w:tcMar>
+            <w:tcBorders>
+              <w:top w:val="single" w:sz="4" w:space="0" w:color="E2E8F0"/>
+              <w:bottom w:val="single" w:sz="4" w:space="0" w:color="E2E8F0"/>
+              <w:left w:val="none"/>
+              <w:right w:val="none"/>
+            </w:tcBorders>
+          </w:tcPr>
+          <w:p>
+            <w:pPr>
+              <w:spacing w:before="20" w:after="20" w:line="264" w:lineRule="auto"/>
+              <w:jc w:val="center"/>
+            </w:pPr>
+            <w:r>
+              <w:rPr>
+                <w:rFonts w:ascii="Times New Roman" w:hAnsi="Times New Roman"/>
+                <w:b w:val="0"/>
+                <w:i w:val="0"/>
+                <w:color w:val="1E293B"/>
+                <w:sz w:val="18"/>
+                <w:rFonts w:ascii="Times New Roman" w:hAnsi="Times New Roman" w:eastAsia="Times New Roman" w:cs="Times New Roman"/>
+              </w:rPr>
+              <w:t>Toàn bộ Dashboard &amp; Terminal Logs</w:t>
+            </w:r>
+          </w:p>
+        </w:tc>
+        <w:tc>
+          <w:tcPr>
+            <w:tcW w:type="dxa" w:w="2736"/>
+            <w:shd w:fill="FFFFFF"/>
+            <w:tcMar>
+              <w:top w:w="50" w:type="dxa"/>
+              <w:bottom w:w="50" w:type="dxa"/>
+              <w:left w:w="70" w:type="dxa"/>
+              <w:right w:w="70" w:type="dxa"/>
+            </w:tcMar>
+            <w:tcBorders>
+              <w:top w:val="single" w:sz="4" w:space="0" w:color="E2E8F0"/>
+              <w:bottom w:val="single" w:sz="4" w:space="0" w:color="E2E8F0"/>
+              <w:left w:val="none"/>
+              <w:right w:val="none"/>
+            </w:tcBorders>
+          </w:tcPr>
+          <w:p>
+            <w:pPr>
+              <w:spacing w:before="20" w:after="20" w:line="264" w:lineRule="auto"/>
+              <w:jc w:val="left"/>
+            </w:pPr>
+            <w:r>
+              <w:rPr>
+                <w:rFonts w:ascii="Times New Roman" w:hAnsi="Times New Roman"/>
+                <w:b w:val="0"/>
+                <w:i w:val="0"/>
+                <w:color w:val="1E293B"/>
+                <w:sz w:val="18"/>
+                <w:rFonts w:ascii="Times New Roman" w:hAnsi="Times New Roman" w:eastAsia="Times New Roman" w:cs="Times New Roman"/>
+              </w:rPr>
+              <w:t>Sẵn sàng các cổng 8501, 9870, 8080</w:t>
+            </w:r>
+          </w:p>
+        </w:tc>
+        <w:tc>
+          <w:tcPr>
+            <w:tcW w:type="dxa" w:w="1584"/>
+            <w:shd w:fill="FFFFFF"/>
             <w:tcMar>
               <w:top w:w="50" w:type="dxa"/>
               <w:bottom w:w="50" w:type="dxa"/>
@@ -1709,7 +2125,7 @@
                 <w:sz w:val="20"/>
                 <w:rFonts w:ascii="Times New Roman" w:hAnsi="Times New Roman" w:eastAsia="Times New Roman" w:cs="Times New Roman"/>
               </w:rPr>
-              <w:t>• Bấm Tab trên Sidebar: "Trang chủ Web Dashboard"</w:t>
+              <w:t>• Bấm Tab trên Sidebar: "1. Bản đồ Kiến trúc &amp; Tổng quan"</w:t>
               <w:br/>
             </w:r>
             <w:r>
@@ -2009,7 +2425,7 @@
                 <w:sz w:val="20"/>
                 <w:rFonts w:ascii="Times New Roman" w:hAnsi="Times New Roman" w:eastAsia="Times New Roman" w:cs="Times New Roman"/>
               </w:rPr>
-              <w:t>• Bấm Tab trên Sidebar: "Bản đồ ứng dụng Big Data &amp; Quản trị dữ liệu HDFS Data Lake"</w:t>
+              <w:t>• Bấm Tab trên Sidebar: "1. Bản đồ Kiến trúc &amp; Tổng quan (Sơ đồ) + 2. Quản trị dữ liệu HDFS Data Lake"</w:t>
               <w:br/>
             </w:r>
             <w:r>
@@ -2102,7 +2518,7 @@
                 <w:sz w:val="19"/>
                 <w:rFonts w:ascii="Times New Roman" w:hAnsi="Times New Roman" w:eastAsia="Times New Roman" w:cs="Times New Roman"/>
               </w:rPr>
-              <w:t>1. Trên Sidebar bên trái, bấm chọn menu: 'Bản đồ ứng dụng Big Data' -&gt; Chỉ vào sơ đồ 5 lớp công nghệ.</w:t>
+              <w:t>1. Trên Sidebar bên trái, bấm chọn menu: '1. Bản đồ Kiến trúc &amp; Tổng quan' -&gt; Chỉ vào 4 thẻ số liệu và sơ đồ 5 lớp công nghệ.</w:t>
             </w:r>
           </w:p>
           <w:p>
@@ -2119,7 +2535,7 @@
                 <w:sz w:val="19"/>
                 <w:rFonts w:ascii="Times New Roman" w:hAnsi="Times New Roman" w:eastAsia="Times New Roman" w:cs="Times New Roman"/>
               </w:rPr>
-              <w:t>2. Tiếp tục bấm chọn menu: 'Quản trị dữ liệu HDFS Data Lake'.</w:t>
+              <w:t>2. Tiếp tục bấm chọn menu: '2. Quản trị dữ liệu HDFS Data Lake'.</w:t>
             </w:r>
           </w:p>
           <w:p>
@@ -2406,7 +2822,7 @@
                 <w:sz w:val="20"/>
                 <w:rFonts w:ascii="Times New Roman" w:hAnsi="Times New Roman" w:eastAsia="Times New Roman" w:cs="Times New Roman"/>
               </w:rPr>
-              <w:t>• Bấm Tab trên Sidebar: "Benchmark hiệu năng Spark vs Pandas"</w:t>
+              <w:t>• Bấm Tab trên Sidebar: "3. Benchmark hiệu năng Spark vs Pandas"</w:t>
               <w:br/>
             </w:r>
             <w:r>
@@ -2488,7 +2904,7 @@
                 <w:sz w:val="19"/>
                 <w:rFonts w:ascii="Times New Roman" w:hAnsi="Times New Roman" w:eastAsia="Times New Roman" w:cs="Times New Roman"/>
               </w:rPr>
-              <w:t>1. Bấm chọn menu: 'Benchmark hiệu năng Spark vs Pandas'.</w:t>
+              <w:t>1. Bấm chọn menu: '3. Benchmark hiệu năng Spark vs Pandas'.</w:t>
             </w:r>
           </w:p>
           <w:p>
@@ -2809,7 +3225,7 @@
                 <w:sz w:val="20"/>
                 <w:rFonts w:ascii="Times New Roman" w:hAnsi="Times New Roman" w:eastAsia="Times New Roman" w:cs="Times New Roman"/>
               </w:rPr>
-              <w:t>• Bấm Tab trên Sidebar: "Tổng quan thị trường &amp; Phân tích Spark SQL"</w:t>
+              <w:t>• Bấm Tab trên Sidebar: "4. Tổng quan thị trường (PySpark ETL) &amp; 5. Phân tích Spark SQL"</w:t>
               <w:br/>
             </w:r>
             <w:r>
@@ -2902,7 +3318,7 @@
                 <w:sz w:val="19"/>
                 <w:rFonts w:ascii="Times New Roman" w:hAnsi="Times New Roman" w:eastAsia="Times New Roman" w:cs="Times New Roman"/>
               </w:rPr>
-              <w:t>1. Bấm menu: 'Tổng quan thị trường' -&gt; Tích vào ô 'Chỉ lấy niên độ gần nhất (2023 - Nay)', chỉ vào thẻ thống kê: 22,751 cầu thủ đang đá với tổng định giá 16.5 tỷ Euro.</w:t>
+              <w:t>1. Bấm menu: '4. Tổng quan thị trường (PySpark ETL)' -&gt; Tích vào ô 'Chỉ lấy niên độ gần nhất (2023 - Nay)', chỉ vào thẻ thống kê: 22,751 cầu thủ đang đá với tổng định giá 16.5 tỷ Euro.</w:t>
             </w:r>
           </w:p>
           <w:p>
@@ -2919,7 +3335,7 @@
                 <w:sz w:val="19"/>
                 <w:rFonts w:ascii="Times New Roman" w:hAnsi="Times New Roman" w:eastAsia="Times New Roman" w:cs="Times New Roman"/>
               </w:rPr>
-              <w:t>2. Bấm menu: 'Phân tích Spark SQL' -&gt; Bấm chuyển giữa 4 tab: Top 15 siêu sao, Vị trí thi đấu, Quốc gia, Độ tuổi. Bấm thử nút 'Trang tiếp ▶' trên bảng phân trang.</w:t>
+              <w:t>2. Bấm menu: '5. Phân tích Spark SQL' -&gt; Bấm chuyển giữa 4 tab: Top 15 siêu sao, Vị trí thi đấu, Quốc gia, Độ tuổi. Bấm thử nút 'Trang tiếp ▶' trên bảng phân trang.</w:t>
             </w:r>
           </w:p>
         </w:tc>
@@ -3223,7 +3639,7 @@
                 <w:sz w:val="20"/>
                 <w:rFonts w:ascii="Times New Roman" w:hAnsi="Times New Roman" w:eastAsia="Times New Roman" w:cs="Times New Roman"/>
               </w:rPr>
-              <w:t>• Bấm Tab trên Sidebar: "Phân cụm K-Means &amp; Dự đoán định giá (ML)"</w:t>
+              <w:t>• Bấm Tab trên Sidebar: "6. Phân cụm K-Means &amp; 7. Dự đoán định giá (ML &amp; XAI)"</w:t>
               <w:br/>
             </w:r>
             <w:r>
@@ -3316,7 +3732,7 @@
                 <w:sz w:val="19"/>
                 <w:rFonts w:ascii="Times New Roman" w:hAnsi="Times New Roman" w:eastAsia="Times New Roman" w:cs="Times New Roman"/>
               </w:rPr>
-              <w:t>1. Bấm menu: 'Phân cụm K-Means' -&gt; Chỉ vào biểu đồ 3 cụm màu sắc và điểm Silhouette Score k=3 đạt 0.6429.</w:t>
+              <w:t>1. Bấm menu: '6. Phân cụm K-Means (MLlib)' -&gt; Chỉ vào biểu đồ 3 cụm màu sắc và điểm Silhouette Score k=3 đạt 0.6429.</w:t>
             </w:r>
           </w:p>
           <w:p>
@@ -3333,7 +3749,7 @@
                 <w:sz w:val="19"/>
                 <w:rFonts w:ascii="Times New Roman" w:hAnsi="Times New Roman" w:eastAsia="Times New Roman" w:cs="Times New Roman"/>
               </w:rPr>
-              <w:t>2. Bấm menu: 'Dự đoán định giá (ML)':</w:t>
+              <w:t>2. Bấm menu: '7. Dự đoán định giá (ML &amp; XAI)':</w:t>
             </w:r>
           </w:p>
           <w:p>
@@ -3671,7 +4087,7 @@
                 <w:sz w:val="20"/>
                 <w:rFonts w:ascii="Times New Roman" w:hAnsi="Times New Roman" w:eastAsia="Times New Roman" w:cs="Times New Roman"/>
               </w:rPr>
-              <w:t>• Bấm Tab trên Sidebar: "Dòng dữ liệu Kafka Streaming &amp; Điều phối Airflow Workflow"</w:t>
+              <w:t>• Bấm Tab trên Sidebar: "8. Dòng dữ liệu Kafka Streaming &amp; 9. Điều phối Airflow Workflow"</w:t>
               <w:br/>
             </w:r>
             <w:r>
@@ -3764,7 +4180,7 @@
                 <w:sz w:val="19"/>
                 <w:rFonts w:ascii="Times New Roman" w:hAnsi="Times New Roman" w:eastAsia="Times New Roman" w:cs="Times New Roman"/>
               </w:rPr>
-              <w:t>1. Bấm menu: 'Dòng dữ liệu Kafka Streaming' -&gt; Xem các dòng tin JSON giao dịch phát trực tiếp thời gian thực (15 thương vụ, tổng 707 triệu Euro).</w:t>
+              <w:t>1. Bấm menu: '8. Dòng dữ liệu Kafka Streaming' -&gt; Xem các dòng tin JSON giao dịch phát trực tiếp thời gian thực (15 thương vụ, tổng 707 triệu Euro).</w:t>
             </w:r>
           </w:p>
           <w:p>
@@ -3781,7 +4197,7 @@
                 <w:sz w:val="19"/>
                 <w:rFonts w:ascii="Times New Roman" w:hAnsi="Times New Roman" w:eastAsia="Times New Roman" w:cs="Times New Roman"/>
               </w:rPr>
-              <w:t>2. Bấm menu: 'Điều phối Airflow Workflow' -&gt; Chỉ vào sơ đồ 7 task tuần tự và trạng thái 100% SUCCESS màu xanh lá.</w:t>
+              <w:t>2. Bấm menu: '9. Điều phối Airflow Workflow' -&gt; Chỉ vào sơ đồ 7 task tuần tự và trạng thái 100% SUCCESS màu xanh lá.</w:t>
             </w:r>
           </w:p>
         </w:tc>
@@ -4051,7 +4467,7 @@
                 <w:sz w:val="20"/>
                 <w:rFonts w:ascii="Times New Roman" w:hAnsi="Times New Roman" w:eastAsia="Times New Roman" w:cs="Times New Roman"/>
               </w:rPr>
-              <w:t>• Bấm Tab trên Sidebar: "Truy vấn CSDL Data Mart"</w:t>
+              <w:t>• Bấm Tab trên Sidebar: "10. Truy vấn CSDL Data Mart"</w:t>
               <w:br/>
             </w:r>
             <w:r>
@@ -4133,7 +4549,7 @@
                 <w:sz w:val="19"/>
                 <w:rFonts w:ascii="Times New Roman" w:hAnsi="Times New Roman" w:eastAsia="Times New Roman" w:cs="Times New Roman"/>
               </w:rPr>
-              <w:t>1. Bấm menu: 'Truy vấn CSDL Data Mart'.</w:t>
+              <w:t>1. Bấm menu: '10. Truy vấn CSDL Data Mart'.</w:t>
             </w:r>
           </w:p>
           <w:p>

</xml_diff>

<commit_message>
feat: complete Big Data infrastructure topology and 6-stage end-to-end ingestion pipeline in dashboard and demo script
</commit_message>
<xml_diff>
--- a/Bao_Cao/Kich_Ban_Demo_Bao_Cao_Cuoi_Ky_BigData.docx
+++ b/Bao_Cao/Kich_Ban_Demo_Bao_Cao_Cuoi_Ky_BigData.docx
@@ -1485,7 +1485,7 @@
           <w:sz w:val="23"/>
           <w:rFonts w:ascii="Times New Roman" w:hAnsi="Times New Roman" w:eastAsia="Times New Roman" w:cs="Times New Roman"/>
         </w:rPr>
-        <w:t>Bước 1: Tổng quan đề tài &amp; Khởi chạy 1-Click (1 phút | Đặng Duy Lợi)</w:t>
+        <w:t>Bước 1: Giải trình Hạ tầng Cụm &amp; Luồng Dữ liệu End-to-End (1 phút | Đặng Duy Lợi)</w:t>
       </w:r>
     </w:p>
     <w:tbl>
@@ -1552,7 +1552,7 @@
                 <w:sz w:val="18"/>
                 <w:rFonts w:ascii="Consolas" w:hAnsi="Consolas" w:eastAsia="Consolas" w:cs="Consolas"/>
               </w:rPr>
-              <w:t>• URL Web Dashboard: http://localhost:8501</w:t>
+              <w:t>• URL Web Dashboard: http://localhost:8501/?page=Bản+đồ+ứng+dụng+Big+Data</w:t>
               <w:br/>
             </w:r>
           </w:p>
@@ -1639,7 +1639,7 @@
                 <w:sz w:val="19"/>
                 <w:rFonts w:ascii="Times New Roman" w:hAnsi="Times New Roman" w:eastAsia="Times New Roman" w:cs="Times New Roman"/>
               </w:rPr>
-              <w:t>2. Chỉ tay vào 4 thẻ số liệu Big Data nền tảng: HDFS (872.5 MB), Spark 4.2 (16 Cores), Kafka (Port 9092), Airflow (7 Tasks SUCCESS).</w:t>
+              <w:t>2. Chỉ tay vào 4 thẻ số liệu Big Data nền tảng: HDFS (872.5 MB, 7.5M dòng), Spark 4.2 (16 Cores), Kafka (Port 9092), Airflow (7 Tasks SUCCESS).</w:t>
             </w:r>
           </w:p>
           <w:p>
@@ -1656,7 +1656,24 @@
                 <w:sz w:val="19"/>
                 <w:rFonts w:ascii="Times New Roman" w:hAnsi="Times New Roman" w:eastAsia="Times New Roman" w:cs="Times New Roman"/>
               </w:rPr>
-              <w:t>3. Cuộn nhẹ chỉ vào sơ đồ 5 lớp công nghệ Lambda Architecture.</w:t>
+              <w:t>3. Bấm Tab 1: '🏛️ Bản đồ Hạ tầng Cụm Big Data' -&gt; Chỉ vào 5 cụm máy chủ phân tán: HDFS (NameNode 9820 &amp; 3 DataNodes), Spark 16 Cores, Kafka 9092, Airflow Docker, Data Mart.</w:t>
+            </w:r>
+          </w:p>
+          <w:p>
+            <w:pPr>
+              <w:spacing w:before="20" w:after="20" w:line="276" w:lineRule="auto"/>
+              <w:jc w:val="left"/>
+            </w:pPr>
+            <w:r>
+              <w:rPr>
+                <w:rFonts w:ascii="Times New Roman" w:hAnsi="Times New Roman"/>
+                <w:b w:val="0"/>
+                <w:i w:val="0"/>
+                <w:color w:val="1E293B"/>
+                <w:sz w:val="19"/>
+                <w:rFonts w:ascii="Times New Roman" w:hAnsi="Times New Roman" w:eastAsia="Times New Roman" w:cs="Times New Roman"/>
+              </w:rPr>
+              <w:t>4. Bấm Tab 2: '🔄 Luồng Hoạt động Dữ liệu Chi tiết' -&gt; Mở rộng 6 giai đoạn tuần tự từ Nạp HDFS (hdfs dfs -put), PySpark ETL, Parquet Snappy (-97.7%), Spark SQL &amp; MLlib, Kafka Streaming đến Data Mart.</w:t>
             </w:r>
           </w:p>
         </w:tc>
@@ -1742,7 +1759,7 @@
                 <w:sz w:val="19"/>
                 <w:rFonts w:ascii="Times New Roman" w:hAnsi="Times New Roman" w:eastAsia="Times New Roman" w:cs="Times New Roman"/>
               </w:rPr>
-              <w:t>"Bài toán thực tế nhóm giải quyết: Trước đây dữ liệu bóng đá cực kỳ rời rạc và việc định giá cầu thủ chủ yếu dựa trên cảm tính. Nhóm đã ứng dụng đầy đủ 7 công nghệ Big Data phân tán để tự động hóa trọn vẹn vòng đời dữ liệu: từ lưu trữ HDFS, tính toán phân tán Spark, bắt tin thời gian thực Kafka, điều phối Airflow đến phục vụ trực quan trên Web."</w:t>
+              <w:t>"Thưa Thầy, đề tài của nhóm xây dựng trọn vẹn hạ tầng phân tán 5 cụm máy chủ và luồng dữ liệu khép kín qua 6 giai đoạn:"</w:t>
             </w:r>
           </w:p>
           <w:p>
@@ -1759,7 +1776,58 @@
                 <w:sz w:val="19"/>
                 <w:rFonts w:ascii="Times New Roman" w:hAnsi="Times New Roman" w:eastAsia="Times New Roman" w:cs="Times New Roman"/>
               </w:rPr>
-              <w:t>"Toàn bộ hệ thống được nhóm đóng gói 1-Click tự động khởi chạy cả 2 máy chủ Web Dashboard (8501) và HDFS NameNode (9870) qua file CHAY_WEB.bat. Sau đây nhóm xin đi sâu vào từng công nghệ cốt lõi!"</w:t>
+              <w:t>"1. Giai đoạn nạp dữ liệu: 12 tệp CSV Transfermarkt nặng 872.5 MB với gần 7.5 triệu bản ghi được nạp vào HDFS Data Lake bằng lệnh hdfs dfs -put, chia thành 18 blocks 128MB và nhân bản 3 lần sang cả 3 DataNode để chống mất dữ liệu."</w:t>
+            </w:r>
+          </w:p>
+          <w:p>
+            <w:pPr>
+              <w:spacing w:before="20" w:after="20" w:line="276" w:lineRule="auto"/>
+              <w:jc w:val="left"/>
+            </w:pPr>
+            <w:r>
+              <w:rPr>
+                <w:rFonts w:ascii="Times New Roman" w:hAnsi="Times New Roman"/>
+                <w:b w:val="0"/>
+                <w:i/>
+                <w:color w:val="1E293B"/>
+                <w:sz w:val="19"/>
+                <w:rFonts w:ascii="Times New Roman" w:hAnsi="Times New Roman" w:eastAsia="Times New Roman" w:cs="Times New Roman"/>
+              </w:rPr>
+              <w:t>"2. Giai đoạn tính toán phân tán: 16 Cores CPU của Apache Spark đọc song song các khối dữ liệu theo cơ chế Data Locality, làm sạch và nén sang định dạng Parquet Snappy chỉ còn 1.41 MB (tiết kiệm đến 97.7% ổ cứng)."</w:t>
+            </w:r>
+          </w:p>
+          <w:p>
+            <w:pPr>
+              <w:spacing w:before="20" w:after="20" w:line="276" w:lineRule="auto"/>
+              <w:jc w:val="left"/>
+            </w:pPr>
+            <w:r>
+              <w:rPr>
+                <w:rFonts w:ascii="Times New Roman" w:hAnsi="Times New Roman"/>
+                <w:b w:val="0"/>
+                <w:i/>
+                <w:color w:val="1E293B"/>
+                <w:sz w:val="19"/>
+                <w:rFonts w:ascii="Times New Roman" w:hAnsi="Times New Roman" w:eastAsia="Times New Roman" w:cs="Times New Roman"/>
+              </w:rPr>
+              <w:t>"3. Tiếp đó dữ liệu chạy qua Spark SQL đa chiều, thuật toán MLlib K-Means và Random Forest định giá khách quan, kết hợp luồng sự kiện thời gian thực Kafka qua cổng 9092, toàn bộ được điều phối tự động bởi Airflow DAG 7 tasks và phục vụ Web qua SQLite Data Mart dưới 10 mili-giây!"</w:t>
+            </w:r>
+          </w:p>
+          <w:p>
+            <w:pPr>
+              <w:spacing w:before="20" w:after="20" w:line="276" w:lineRule="auto"/>
+              <w:jc w:val="left"/>
+            </w:pPr>
+            <w:r>
+              <w:rPr>
+                <w:rFonts w:ascii="Times New Roman" w:hAnsi="Times New Roman"/>
+                <w:b w:val="0"/>
+                <w:i/>
+                <w:color w:val="1E293B"/>
+                <w:sz w:val="19"/>
+                <w:rFonts w:ascii="Times New Roman" w:hAnsi="Times New Roman" w:eastAsia="Times New Roman" w:cs="Times New Roman"/>
+              </w:rPr>
+              <w:t>"Toàn bộ hệ thống được nhóm đóng gói 1-Click qua file CHAY_WEB.bat và CHAY_DATANODE.bat. Sau đây nhóm xin đi sâu vào từng tầng công nghệ!"</w:t>
             </w:r>
           </w:p>
         </w:tc>

</xml_diff>